<commit_message>
cambios en casa 27 ago2026
</commit_message>
<xml_diff>
--- a/documentacion/TESIS_AGO2026_Rev40_(ZUJ)_24ago2026_HorizonteSemanal.docx
+++ b/documentacion/TESIS_AGO2026_Rev40_(ZUJ)_24ago2026_HorizonteSemanal.docx
@@ -17202,7 +17202,7 @@
         </w:rPr>
       </w:pPr>
       <w:r>
-        <w:t>H1. Al menos una configuración predictiva basada en modelos estadísticos o de aprendizaje automático, entrenada con información histórica semanal y variables exógenas disponibles al momento del pronóstico, presentará un error de pronóstico significativamente menor que la regla empírica de referencia para estimar el importe semanal de compras de la microempresa.</w:t>
+        <w:t>H1. Al menos una configuración predictiva basada en modelos estadísticos o de aprendizaje automático, entrenada con información histórica semanal y variables exógenas disponibles al momento del pronóstico, presentará un error de pronóstico significativamente menor que la línea base primaria de último valor semanal observado para estimar el importe semanal de compras de la microempresa.</w:t>
       </w:r>
     </w:p>
     <w:p>
@@ -19502,6 +19502,12 @@
       </w:r>
       <w:r>
         <w:t>. El suavizamiento exponencial calcula medias ponderadas de observaciones pasadas donde los pesos asignados a los datos decrecen de manera geométrica o exponencial a medida que los registros son más antiguos.</w:t>
+      </w:r>
+    </w:p>
+    <w:p>
+      <w:pPr/>
+      <w:r>
+        <w:t>En series con compras intermitentes, el pronóstico puede descomponerse en dos preguntas: si ocurrirá una compra y cuál será su importe condicionado a que ocurra. El modelo hurdle estima ambas partes por separado y las combina como valor esperado semanal. Esta alternativa se evaluará junto con modelos directos y variantes log1p; su utilidad se juzgará únicamente mediante errores fuera de muestra y no se presumirá por su mayor complejidad.</w:t>
       </w:r>
     </w:p>
     <w:p>
@@ -26410,7 +26416,7 @@
     </w:p>
     <w:p>
       <w:r>
-        <w:t>En el contexto de esta investigación, el objeto evaluado es la precisión predictiva del importe semanal de compras. Las líneas base serán el último valor semanal, el promedio móvil de cuatro semanas y, cuando la cobertura lo permita, el pronóstico ingenuo estacional de 52 semanas; todos se compararán en las mismas ventanas futuras.</w:t>
+        <w:t>En el contexto de esta investigación, el objeto evaluado es la precisión predictiva del importe semanal de compras. La línea base primaria será el método ingenuo de persistencia o último valor semanal observado: para cada semana futura, el pronóstico será igual al importe registrado en la semana completa inmediatamente anterior. Se conservarán los ceros observados; las ausencias de cobertura y los valores sintéticos se excluirán. El promedio móvil de cuatro semanas y, cuando la cobertura lo permita, el pronóstico ingenuo estacional de 52 semanas se mantendrán como comparadores obligatorios en las mismas ventanas futuras.</w:t>
       </w:r>
     </w:p>
     <w:p>
@@ -26453,7 +26459,7 @@
         <w:spacing w:after="120" w:line="276" w:lineRule="auto"/>
       </w:pPr>
       <w:r>
-        <w:t>La evaluación utilizará rolling-window (ventana deslizante) con 52 semanas de entrenamiento, horizonte principal de una semana y desplazamiento de una semana. Cada iteración entrenará sólo con las 52 semanas previas al periodo de prueba; al avanzar, se incorporará la semana más reciente y se excluirá la más antigua. El horizonte de cuatro semanas se reportará como análisis complementario para consolidar el presupuesto mensual.</w:t>
+        <w:t>La evaluación utilizará rolling-window (ventana deslizante) con 52 semanas de entrenamiento y desplazamiento de una semana. El horizonte principal será h=1; el horizonte complementario h=4 se estimará de forma directa, usando únicamente la información disponible en el origen y las variables exógenas conocidas para la semana objetivo. Las métricas de h=1 y h=4 se reportarán por separado. El consolidado presupuestal de cuatro semanas será la suma de los pronósticos directos h=1, h=2, h=3 y h=4, y no un modelo mensual independiente.</w:t>
       </w:r>
     </w:p>
     <w:p>
@@ -26539,7 +26545,7 @@
     </w:p>
     <w:p>
       <w:r>
-        <w:t>Para contrastar las hipótesis, H1 evaluará si alguna configuración estadística o de aprendizaje automático presenta menor error que la regla empírica semanal; H2 comparará configuraciones equivalentes con y sin variables exógenas. Las diferencias se examinarán sobre los errores fuera de muestra generados por rolling-window (ventana deslizante), sin atribuir causalidad fuera de las configuraciones evaluadas.</w:t>
+        <w:t>Para contrastar las hipótesis, H1 evaluará principalmente en h=1 si alguna configuración estadística o de aprendizaje automático presenta menor error cuadrático que la línea base de último valor semanal observado; H2 comparará configuraciones equivalentes con y sin variables exógenas. El horizonte h=4 se examinará de manera complementaria, sin mezclar sus métricas con h=1. Las diferencias se examinarán sobre los errores fuera de muestra generados por rolling-window (ventana deslizante). Para H1 se aplicará una prueba Diebold-Mariano unilateral con corrección de muestra finita; como se comparan varias configuraciones frente a la misma referencia, los valores p se ajustarán mediante el procedimiento Holm. H1 sólo se considerará respaldada si al menos una configuración mantiene una diferencia favorable y un valor p ajustado no mayor a 0.05.</w:t>
       </w:r>
       <w:r>
         <w:rPr>
@@ -26572,6 +26578,24 @@
       </w:r>
     </w:p>
     <w:p>
+      <w:pPr/>
+      <w:r>
+        <w:t>La incorporación de variables exógenas se controlará mediante un registro explícito de fuente, disponibilidad y rezago. El pipeline sólo admitirá predictores incluidos en dicho registro; cualquier variable exógena no documentada se bloqueará antes del modelado. El sistema de soporte a la decisión comunicará este inventario como condición para generar pronósticos futuros, evitando utilizar información que no esté disponible ex ante.</w:t>
+      </w:r>
+    </w:p>
+    <w:p>
+      <w:pPr/>
+      <w:r>
+        <w:t>Para asegurar la reproducibilidad, las rutas de datos y resultados se resolverán desde la ubicación del proyecto, sin depender de una carpeta fija del equipo. Cada ejecución exportará un manifiesto con las huellas de las fuentes y del código, versiones de las bibliotecas, semilla aleatoria, parámetros de ventana y diccionario de variables. Este diccionario documentará la fuente, el rezago y la disponibilidad temporal de cada predictor; los indicadores publicados u observados se desplazarán para representar únicamente la información disponible antes del pronóstico.</w:t>
+      </w:r>
+    </w:p>
+    <w:p>
+      <w:pPr/>
+      <w:r>
+        <w:t>Cuando se identifique una cola de semanas sin cobertura de compras, dichas semanas se tratarán como ausencia de observación y no como importes cero. Cualquier extensión sintética se almacenará en un archivo independiente, con una etiqueta de procedencia, semilla y método de generación. Sus valores podrán utilizarse únicamente en análisis de sensibilidad o pruebas técnicas del sistema de soporte a la decisión; se excluirán del ajuste, la selección de modelos, la evaluación fuera de muestra y el contraste de H1 y H2.</w:t>
+      </w:r>
+    </w:p>
+    <w:p>
       <w:pPr>
         <w:pStyle w:val="Ttulo2"/>
         <w:numPr>
@@ -26769,7 +26793,7 @@
           <w:b/>
           <w:bCs/>
         </w:rPr>
-        <w:t>Modelos estadísticos: se evaluarán ETS, ARIMA y SARIMA semanal; si se mantienen semanas con cero, se considerarán Croston, SBA y TSB, según su compatibilidad con la variable objetivo.</w:t>
+        <w:t>Modelos estadísticos: se evaluarán ETS, ARIMA, Croston-SBA y TSB. Los dos últimos se incluyen porque separan la frecuencia y el tamaño de los eventos de compra cuando la serie semanal contiene ceros.</w:t>
       </w:r>
       <w:r/>
       <w:r>
@@ -26800,7 +26824,7 @@
           <w:b/>
           <w:bCs/>
         </w:rPr>
-        <w:t>Modelos de aprendizaje automático: se evaluarán Ridge o Lasso, Random Forest y XGBoost o LightGBM, con variables históricas, calendáricas y exógenas disponibles al momento de pronosticar.</w:t>
+        <w:t>Modelos de aprendizaje automático: se evaluarán Ridge, Random Forest e HistGradientBoosting con variables históricas, calendáricas y exógenas disponibles al momento de pronosticar. También se compararán variantes con transformación log1p del importe, que atenúan la influencia de picos al ajustar y revierten la escala al pronosticar.</w:t>
       </w:r>
       <w:r/>
       <w:r>
@@ -36816,7 +36840,7 @@
         </w:tabs>
       </w:pPr>
       <w:r>
-        <w:t>Con 07_modelos_estadisticos_ml_rolling_origin.py se comparan el método empírico, ARIMA y SARIMA, regresión lineal, árboles de decisión y bosque aleatorio. La evaluación utiliza validación Rolling-Origin para simular pronósticos sucesivos a lo largo del tiempo y reporta MAE, RMSE y MAPE. El ajuste de hiperparámetros se realiza con orígenes anteriores a los reservados para evaluación, de modo que las configuraciones finales se prueben en periodos no utilizados durante su selección.</w:t>
+        <w:t>La evaluación operativa se ejecuta con 06_modelos_rolling_window.py. Este módulo compara referencias empíricas, ETS, ARIMA, Croston-SBA, TSB y configuraciones de Ridge, Random Forest e HistGradientBoosting. La ventana deslizante conserva 52 semanas de entrenamiento; los hiperparámetros se ajustan en orígenes temporales previos a los 16 orígenes reservados para evaluación.</w:t>
       </w:r>
     </w:p>
     <w:p>
@@ -36849,7 +36873,7 @@
         </w:tabs>
       </w:pPr>
       <w:r>
-        <w:t>En conjunto, esta secuencia genera tres representaciones comparables —dataset completo, dataset reducido y dataset PCA— y somete sus resultados a un mismo esquema temporal de evaluación. Así, la selección final puede sustentarse simultáneamente en precisión, estabilidad, parsimonia e interpretabilidad, en lugar de depender únicamente del mejor ajuste observado durante el entrenamiento.</w:t>
+        <w:t>En conjunto, el pipeline semanal genera un conjunto de modelado trazable, selecciona predictores a partir de cada ventana de entrenamiento y conserva predicciones, métricas, contrastes y un manifiesto de ejecución. El objetivo es comparar precisión fuera de muestra, no reproducir el esquema diario heredado de conjuntos completo, reducido y PCA.</w:t>
       </w:r>
     </w:p>
     <w:p>
@@ -37095,7 +37119,7 @@
         <w:spacing w:after="120"/>
       </w:pPr>
       <w:r>
-        <w:t>La línea base representó una referencia empírica reproducible con la que se contrastaron los modelos. Para cada objetivo se evaluaron la persistencia del último valor y el promedio móvil de siete días; se conservó como referencia el método con menor RMSE en cada ventana temporal. Este planteamiento permitió cuantificar la ganancia predictiva sin equiparar la línea base con un grupo control ni atribuir causalidad experimental. Los datos correspondientes se sintetizan en la Tabla 7.</w:t>
+        <w:t>La referencia primaria es la persistencia del último importe semanal observado. Como comparadores obligatorios se conservan el promedio móvil de cuatro semanas y el ingenuo estacional de 52 semanas. La comparación se realiza en las mismas semanas y contra la misma ventana de entrenamiento, sin equiparar la línea base con un grupo de control ni atribuir causalidad experimental.</w:t>
       </w:r>
     </w:p>
     <w:p>
@@ -37892,48 +37916,21 @@
         <w:spacing w:after="120"/>
       </w:pPr>
       <w:r>
-        <w:t xml:space="preserve">La ingeniería de características transformó las series originales en una representación supervisada de 271 predictores. Se incorporaron calendario, codificación cíclica, eventos </w:t>
-      </w:r>
-      <w:r>
-        <w:lastRenderedPageBreak/>
-        <w:t xml:space="preserve">exógenos, rezagos, ventanas móviles, composición por categorías, estabilidad y recencia. Todas las características históricas se desplazaron temporalmente y se eliminaron los primeros 28 días para asegurar ventanas completas. La representación visual correspondiente se presenta en la Figura </w:t>
-      </w:r>
-      <w:r>
-        <w:fldChar w:fldCharType="begin"/>
-      </w:r>
-      <w:r>
-        <w:instrText xml:space="preserve"> REF xref_figura_03 \h </w:instrText>
-      </w:r>
-      <w:r>
-        <w:fldChar w:fldCharType="separate"/>
-      </w:r>
-      <w:r>
-        <w:t>25</w:t>
-      </w:r>
-      <w:r>
-        <w:fldChar w:fldCharType="end"/>
-      </w:r>
-      <w:r>
-        <w:t xml:space="preserve">. Los datos correspondientes se sintetizan en la Tabla </w:t>
-      </w:r>
-      <w:r>
-        <w:fldChar w:fldCharType="begin"/>
-      </w:r>
-      <w:r>
-        <w:instrText xml:space="preserve"> REF xref_tabla_09 \h </w:instrText>
-      </w:r>
-      <w:r>
-        <w:fldChar w:fldCharType="separate"/>
-      </w:r>
-      <w:r>
-        <w:t>9</w:t>
-      </w:r>
-      <w:r>
-        <w:fldChar w:fldCharType="end"/>
-      </w:r>
-      <w:r>
-        <w:t>.</w:t>
-      </w:r>
+        <w:t>La ingeniería de características semanal incorpora rezagos, medias móviles, codificación cíclica y variables exógenas registradas. Toda variable histórica se construye con información anterior al origen; para pronósticos directos a más de una semana, las características históricas se congelan en el origen y sólo se admiten exógenas disponibles para la semana objetivo.</w:t>
+      </w:r>
+      <w:r/>
+      <w:r/>
+      <w:r/>
+      <w:r/>
+      <w:r/>
+      <w:r/>
+      <w:r/>
+      <w:r/>
+      <w:r/>
+      <w:r/>
+      <w:r/>
+      <w:r/>
+      <w:r/>
     </w:p>
     <w:p>
       <w:pPr>
@@ -38337,48 +38334,21 @@
         <w:spacing w:after="120"/>
       </w:pPr>
       <w:r>
-        <w:t xml:space="preserve">Se compararon enfoques empíricos, ARIMA/SARIMA, regresión lineal, árboles, Random Forest, RNN y LSTM. Cada familia se entrenó sobre representaciones completa, reducida y </w:t>
-      </w:r>
-      <w:r>
-        <w:lastRenderedPageBreak/>
-        <w:t xml:space="preserve">PCA cuando resultó procedente. Los hiperparámetros se seleccionaron dentro del conjunto de entrenamiento de cada origen temporal; la comparación final privilegió RMSE, MAE, estabilidad entre ventanas e interpretabilidad. La representación visual correspondiente se presenta en la Figura </w:t>
-      </w:r>
-      <w:r>
-        <w:fldChar w:fldCharType="begin"/>
-      </w:r>
-      <w:r>
-        <w:instrText xml:space="preserve"> REF xref_figura_04 \h </w:instrText>
-      </w:r>
-      <w:r>
-        <w:fldChar w:fldCharType="separate"/>
-      </w:r>
-      <w:r>
-        <w:t>26</w:t>
-      </w:r>
-      <w:r>
-        <w:fldChar w:fldCharType="end"/>
-      </w:r>
-      <w:r>
-        <w:t xml:space="preserve">. Los datos correspondientes se sintetizan en la Tabla </w:t>
-      </w:r>
-      <w:r>
-        <w:fldChar w:fldCharType="begin"/>
-      </w:r>
-      <w:r>
-        <w:instrText xml:space="preserve"> REF xref_tabla_10 \h </w:instrText>
-      </w:r>
-      <w:r>
-        <w:fldChar w:fldCharType="separate"/>
-      </w:r>
-      <w:r>
-        <w:t>10</w:t>
-      </w:r>
-      <w:r>
-        <w:fldChar w:fldCharType="end"/>
-      </w:r>
-      <w:r>
-        <w:t>.</w:t>
-      </w:r>
+        <w:t>Se comparan referencias empíricas, ETS, ARIMA, Croston-SBA, TSB y modelos de aprendizaje automático parsimoniosos. Las variantes log1p y hurdle se mantienen para manejar picos e intermitencia. RNN y LSTM no forman parte de la evidencia principal semanal, debido al número limitado de observaciones y a su riesgo de sobreajuste.</w:t>
+      </w:r>
+      <w:r/>
+      <w:r/>
+      <w:r/>
+      <w:r/>
+      <w:r/>
+      <w:r/>
+      <w:r/>
+      <w:r/>
+      <w:r/>
+      <w:r/>
+      <w:r/>
+      <w:r/>
+      <w:r/>
     </w:p>
     <w:p>
       <w:pPr>
@@ -38560,44 +38530,20 @@
         <w:spacing w:after="120"/>
       </w:pPr>
       <w:r>
-        <w:t xml:space="preserve">La evaluación se ejecutó mediante Rolling-Origin. Los conjuntos de entrenamiento crecieron de forma acumulativa y cada prueba se situó después del último dato empleado para ajustar el modelo. La selección global se basó en el promedio del error y su variabilidad en los tres orígenes finales. La representación visual correspondiente se presenta en la Figura </w:t>
-      </w:r>
-      <w:r>
-        <w:fldChar w:fldCharType="begin"/>
-      </w:r>
-      <w:r>
-        <w:instrText xml:space="preserve"> REF xref_figura_05 \h </w:instrText>
-      </w:r>
-      <w:r>
-        <w:fldChar w:fldCharType="separate"/>
-      </w:r>
-      <w:r>
-        <w:t>28</w:t>
-      </w:r>
-      <w:r>
-        <w:fldChar w:fldCharType="end"/>
-      </w:r>
-      <w:r>
-        <w:t xml:space="preserve">. La relación se formaliza en la ecuación </w:t>
-      </w:r>
-      <w:r>
-        <w:fldChar w:fldCharType="begin"/>
-      </w:r>
-      <w:r>
-        <w:instrText xml:space="preserve"> REF xref_ecuacion_10 \h </w:instrText>
-      </w:r>
-      <w:r>
-        <w:fldChar w:fldCharType="separate"/>
-      </w:r>
-      <w:r>
-        <w:t>(10)</w:t>
-      </w:r>
-      <w:r>
-        <w:fldChar w:fldCharType="end"/>
-      </w:r>
-      <w:r>
-        <w:t>.</w:t>
-      </w:r>
+        <w:t>La evaluación se ejecuta mediante rolling-window (ventana deslizante) con 52 semanas fijas de entrenamiento, desplazamiento de una semana y 16 orígenes finales comunes. Las métricas se calculan por separado para h=1 y h=4. Para el consolidado presupuestal se suman los pronósticos directos h=1, h=2, h=3 y h=4; esta suma no se interpreta como un modelo mensual independiente.</w:t>
+      </w:r>
+      <w:r/>
+      <w:r/>
+      <w:r/>
+      <w:r/>
+      <w:r/>
+      <w:r/>
+      <w:r/>
+      <w:r/>
+      <w:r/>
+      <w:r/>
+      <w:r/>
+      <w:r/>
     </w:p>
     <w:p>
       <w:pPr>
@@ -38695,7 +38641,7 @@
     </w:p>
     <w:p>
       <w:r>
-        <w:t>El tablero desarrollado para Cup&amp;Cake funciona como un sistema de soporte a la decisión (Decision Support System, DSS) que integra los resultados del pipeline predictivo y los transforma en información comprensible para la planeación financiera y de abastecimiento. Su propósito no es sustituir el criterio de la persona responsable del negocio, sino reducir la complejidad de los resultados estadísticos, hacer explícitas sus limitaciones y facilitar decisiones sustentadas en evidencia.</w:t>
+        <w:t>El archivo de salida para el sistema de soporte a la decisión comunica resultados semanales auditables: métricas por horizonte, contrastes H1 y H2, predicciones históricas, consolidaciones de cuatro semanas y el inventario de variables exógenas admitidas. Su propósito es facilitar la revisión humana del presupuesto, no sustituirla.</w:t>
       </w:r>
     </w:p>
     <w:p>
@@ -38734,12 +38680,12 @@
     </w:p>
     <w:p>
       <w:r>
-        <w:t>Los resultados consolidados se incorporan al tablero como una estructura de datos en JavaScript. Para cada objetivo se almacenan el modelo ganador, la versión del dataset utilizada, los valores promedio de RMSE, MAE y MAPE, la cobertura temporal efectiva, las observaciones excluidas y los errores obtenidos en tres ventanas de evaluación Rolling-Origin. Esta organización conserva la relación entre la configuración seleccionada y la evidencia con la que fue evaluada.</w:t>
-      </w:r>
-    </w:p>
-    <w:p>
-      <w:r>
-        <w:t>El flujo de integración puede resumirse de la siguiente manera: las salidas del pipeline de modelado se consolidan por variable objetivo; posteriormente se seleccionan el modelo y el dataset con menor RMSE promedio; los resultados se incorporan a la estructura interna del tablero; y, finalmente, la interfaz calcula la mejora frente a la línea base elegida y actualiza los indicadores, la gráfica y la interpretación para la decisión. De esta forma, el tablero constituye la capa de presentación del proceso analítico y mantiene trazabilidad con la validación temporal.</w:t>
+        <w:t>La integración se realiza mediante 04_dss_semanal.json, generado a partir de la última ejecución del pipeline. El archivo conserva la relación entre cada configuración, las métricas por horizonte, los contrastes estadísticos y las variables exógenas registradas; por ello, evita presentar resultados heredados de un esquema diario como si fueran evidencia semanal actual.</w:t>
+      </w:r>
+    </w:p>
+    <w:p>
+      <w:r>
+        <w:t>El flujo de integración parte de la ejecución semanal reproducible, exporta predicciones y métricas por horizonte, construye el consolidado h=1+h=2+h=3+h=4 y comunica las advertencias de cobertura y disponibilidad ex ante. La interfaz que consuma esta salida debe actualizarse junto con cada nueva ejecución; de otro modo, sólo representa una instantánea histórica.</w:t>
       </w:r>
     </w:p>
     <w:p>
@@ -38754,18 +38700,17 @@
     </w:p>
     <w:p>
       <w:r>
-        <w:t>La interfaz permite seleccionar cuatro objetivos: importe real de ventas, número de registros de venta, importe real de compras y número de registros de compra. También permite alternar entre dos referencias empíricas: el promedio móvil de siete días y el último valor observado. Esta combinación posibilita examinar el desempeño desde una perspectiva monetaria o de frecuencia operativa y comprobar si la conclusión se mantiene al cambiar el criterio de comparación.</w:t>
-      </w:r>
-    </w:p>
-    <w:p>
-      <w:r>
-        <w:lastRenderedPageBreak/>
-        <w:t>Como indicadores principales, el tablero muestra el modelo ganador, el dataset asociado, el RMSE promedio, el MAE promedio y el porcentaje de reducción de RMSE respecto de la línea base. La mejora se calcula como la diferencia entre el RMSE de referencia y el RMSE del modelo, dividida entre el RMSE de referencia y expresada en porcentaje. Una barra de progreso y un estado cualitativo indican si se alcanza la reducción mínima de 20% establecida en la hipótesis H1.</w:t>
-      </w:r>
-    </w:p>
-    <w:p>
-      <w:r>
-        <w:t>La visualización central compara el RMSE del modelo y el método empírico en tres ventanas temporales. Esta desagregación evita que un promedio global oculte periodos con errores elevados y permite valorar la estabilidad del pronóstico. El panel lateral complementa la gráfica con una lectura ejecutiva, una advertencia metodológica, el MAPE, la cobertura efectiva y el número de días excluidos. Finalmente, una franja de calidad resume las dimensiones de los datasets, el periodo analizado y la ausencia de valores nulos en el maestro.</w:t>
+        <w:t>Para esta investigación, la salida del DSS se limita al importe semanal de compras. Debe mostrar por separado el desempeño en h=1 y h=4, el presupuesto consolidado de cuatro semanas y las variables exógenas registradas. No debe mezclar los resultados del pipeline semanal con los indicadores diarios heredados.</w:t>
+      </w:r>
+    </w:p>
+    <w:p>
+      <w:r>
+        <w:t>Los indicadores principales son RMSE, MAE y métricas escaladas por horizonte, junto con la línea base primaria de último valor semanal observado. MAPE se conserva sólo como diagnóstico para observaciones distintas de cero. La aceptación de H1 requiere una prueba Diebold-Mariano unilateral favorable con ajuste Holm no mayor a 0.05; una reducción descriptiva de RMSE por sí sola no es suficiente.</w:t>
+      </w:r>
+    </w:p>
+    <w:p>
+      <w:r>
+        <w:t>La visualización central debe comparar rankings y errores de h=1 y h=4 en paneles separados. El consolidado de cuatro semanas se presenta como una suma de pronósticos directos, con sus importes observados y pronosticados, para que el usuario no lo interprete como una estimación mensual independiente.</w:t>
       </w:r>
     </w:p>
     <w:p>
@@ -38780,22 +38725,19 @@
     </w:p>
     <w:p>
       <w:r>
-        <w:t>Para los objetivos de ventas, el tablero identifica modelos ARIMA sobre el dataset completo. El importe de ventas utiliza una configuración ARIMA (1,1,2), con RMSE promedio de 161.1493, mientras que el número de registros de venta utiliza ARIMA (1,1,1), con RMSE de 0.5251. Frente al promedio móvil de siete días, las reducciones aproximadas son 3.2% y 5.1%, respectivamente; por lo tanto, las mejoras no alcanzan el umbral de 20% establecido en H1.</w:t>
-      </w:r>
-    </w:p>
-    <w:p>
-      <w:r>
-        <w:t>En compras, los resultados favorecen a Random Forest entrenado con el dataset reducido. Para el importe real de compras se obtuvo un RMSE promedio de 213.0144 frente a 297.2899 de la línea base de siete días, equivalente a una reducción aproximada de 28.3%. Para el número de registros de compra, el RMSE disminuyó de 3.3579 a 2.5932, lo que representa una mejora aproximada de 22.8%. Ambos objetivos superan la meta de H1 cuando se utiliza esta línea base.</w:t>
-      </w:r>
-    </w:p>
-    <w:p>
-      <w:r>
-        <w:t xml:space="preserve">La conclusión global presentada por el DSS es, por consiguiente, parcial: la evidencia apoya la hipótesis para las variables de compras, pero no para las de ventas. El tablero evita una </w:t>
-      </w:r>
-      <w:r>
-        <w:lastRenderedPageBreak/>
-        <w:t>aceptación general de H1 y muestra que la utilidad del aprendizaje automático depende del objetivo específico, del comportamiento de la serie y de la referencia empírica utilizada.</w:t>
-      </w:r>
+        <w:t>La evidencia semanal actual no analiza objetivos diarios de ventas. El DSS no debe conservar conclusiones de modelos de ventas generadas por el pipeline diario heredado, pues no responden a la pregunta de investigación ni al horizonte semanal definido.</w:t>
+      </w:r>
+    </w:p>
+    <w:p>
+      <w:r>
+        <w:t>En el horizonte principal h=1, Ridge con variables históricas obtuvo el menor RMSE descriptivo (502.11) y MAE de 325.98. La referencia primaria de último valor semanal observado registró RMSE de 595.02 y MAE de 400.19. Esta diferencia descriptiva se reporta junto con el contraste inferencial, sin convertirla automáticamente en confirmación de H1.</w:t>
+      </w:r>
+    </w:p>
+    <w:p>
+      <w:r>
+        <w:t>La conclusión del DSS es prudente: ningún contraste frente a la línea base primaria fue significativo después del ajuste Holm, tanto en h=1 como en h=4. Por ello, el sistema comunica los modelos con menor error descriptivo como alternativas exploratorias y conserva la referencia empírica como comparación obligatoria.</w:t>
+      </w:r>
+      <w:r/>
     </w:p>
     <w:p>
       <w:pPr>
@@ -38809,31 +38751,19 @@
     </w:p>
     <w:p>
       <w:r>
-        <w:t>El DSS traduce cada resultado en una recomendación operativa. Para las compras, la reducción de errores extremos respalda el uso de Random Forest como insumo para la presupuestación y la programación del abastecimiento. Para las ventas, la mejora moderada de ARIMA sugiere conservar políticas de seguridad y evitar asumir que una mayor complejidad garantiza un pronóstico superior. Asimismo, el tablero advierte que el MAPE puede resultar inestable en días con valores reales cercanos a cero, por lo que la interpretación principal se apoya en RMSE y MAE.</w:t>
-      </w:r>
-    </w:p>
-    <w:p>
-      <w:r>
-        <w:t xml:space="preserve">La cobertura temporal se presenta como una condición de uso y no como un dato secundario. Las variables de ventas abarcan hasta el 31 de mayo de 2026, mientras que la información de compras termina el 30 de julio de 2025 y deja 305 días sin cobertura. Esta advertencia impide interpretar las mejoras de compras como una autorización automática para desplegar el modelo con información desactualizada; antes de su utilización operativa es necesario actualizar la fuente y volver a ejecutar el proceso de validación. La representación visual correspondiente se presenta en la Figura </w:t>
-      </w:r>
-      <w:r>
-        <w:fldChar w:fldCharType="begin"/>
-      </w:r>
-      <w:r>
-        <w:instrText xml:space="preserve"> REF xref_figura_06 \h </w:instrText>
-      </w:r>
-      <w:r>
-        <w:fldChar w:fldCharType="separate"/>
-      </w:r>
-      <w:r>
-        <w:t>29</w:t>
-      </w:r>
-      <w:r>
-        <w:fldChar w:fldCharType="end"/>
-      </w:r>
-      <w:r>
-        <w:t>.</w:t>
-      </w:r>
+        <w:t>El DSS debe apoyar la revisión del presupuesto y mostrar la incertidumbre asociada a cada horizonte. En h=1 puede comunicarse Ridge histórico como el menor RMSE descriptivo; en h=4, el promedio móvil de cuatro semanas obtuvo el menor RMSE descriptivo (652.52). Ninguno de estos resultados autoriza automatizar compras ni afirmar superioridad estadísticamente demostrada.</w:t>
+      </w:r>
+    </w:p>
+    <w:p>
+      <w:r>
+        <w:t>La cobertura se presenta como una condición de uso: después de depurar la cola sin observación, quedaron 135 semanas con compras observadas y se excluyeron 43 semanas sin cobertura. Los datos sintéticos se mantienen fuera del ajuste y de los contrastes. Antes de utilizar el sistema con fines operativos, deben actualizarse las fuentes y repetirse la evaluación.</w:t>
+      </w:r>
+      <w:r/>
+      <w:r/>
+      <w:r/>
+      <w:r/>
+      <w:r/>
+      <w:r/>
     </w:p>
     <w:p>
       <w:pPr>
@@ -39083,7 +39013,7 @@
         <w:spacing w:after="120"/>
       </w:pPr>
       <w:r>
-        <w:t>El pipeline se completó sin errores. El dataset maestro reunió 1,612 días consecutivos entre el 1 de enero de 2022 y el 31 de mayo de 2026, con 65 columnas, sin fechas faltantes ni valores nulos. Después de exigir 28 días de historia para rezagos y ventanas, el dataset de modelado conservó 1,584 observaciones. La cobertura de ventas llegó a mayo de 2026; la de compras terminó el 30 de julio de 2025, por lo que 305 días posteriores se excluyeron de la evaluación de esos objetivos.</w:t>
+        <w:t>El pipeline semanal se ejecutó con 135 semanas observadas de compras; una cola de 43 semanas sin cobertura se excluyó como ausencia de observación y no como importe cero. La evaluación utilizó una ventana de entrenamiento de 52 semanas y 16 orígenes temporales finales comunes. Los datos sintéticos se conservaron en un archivo independiente y no participaron en el ajuste, la evaluación ni los contrastes de hipótesis.</w:t>
       </w:r>
     </w:p>
     <w:p>
@@ -39105,44 +39035,20 @@
         <w:spacing w:after="120"/>
       </w:pPr>
       <w:r>
-        <w:t xml:space="preserve">El perfil inicial identificó 271 predictores. La selección supervisada conservó 80 variables y produjo un dataset reducido de 85 columnas al añadir fecha y cuatro objetivos. Como representación alternativa, PCA necesitó 130 componentes para explicar al menos 95 % de la varianza, lo que confirma que la estructura informativa se encontraba distribuida en numerosas dimensiones. La mejora frente a la línea base y la selección de modelos se muestran, respectivamente, en las Figuras </w:t>
-      </w:r>
-      <w:r>
-        <w:fldChar w:fldCharType="begin"/>
-      </w:r>
-      <w:r>
-        <w:instrText xml:space="preserve"> REF xref_figura_08 \h </w:instrText>
-      </w:r>
-      <w:r>
-        <w:fldChar w:fldCharType="separate"/>
-      </w:r>
-      <w:r>
-        <w:t>31</w:t>
-      </w:r>
-      <w:r>
-        <w:fldChar w:fldCharType="end"/>
-      </w:r>
-      <w:r>
-        <w:t xml:space="preserve"> y </w:t>
-      </w:r>
-      <w:r>
-        <w:fldChar w:fldCharType="begin"/>
-      </w:r>
-      <w:r>
-        <w:instrText xml:space="preserve"> REF xref_figura_09 \h </w:instrText>
-      </w:r>
-      <w:r>
-        <w:fldChar w:fldCharType="separate"/>
-      </w:r>
-      <w:r>
-        <w:t>32</w:t>
-      </w:r>
-      <w:r>
-        <w:fldChar w:fldCharType="end"/>
-      </w:r>
-      <w:r>
-        <w:t>.</w:t>
-      </w:r>
+        <w:t>El conjunto semanal de modelado integra características históricas, cíclicas y exógenas con disponibilidad documentada. La selección se realiza dentro de cada ventana de entrenamiento y se limita a un máximo de 15 predictores; este criterio favorece parsimonia e interpretabilidad ante el tamaño muestral disponible.</w:t>
+      </w:r>
+      <w:r/>
+      <w:r/>
+      <w:r/>
+      <w:r/>
+      <w:r/>
+      <w:r/>
+      <w:r/>
+      <w:r/>
+      <w:r/>
+      <w:r/>
+      <w:r/>
+      <w:r/>
     </w:p>
     <w:p>
       <w:pPr>
@@ -39158,6 +39064,18 @@
         <w:t>Rendimiento comparativo de los modelos</w:t>
       </w:r>
       <w:bookmarkEnd w:id="251"/>
+    </w:p>
+    <w:p>
+      <w:pPr/>
+      <w:r>
+        <w:t>La evaluación comparativa se reporta por horizonte. En h=1, Ridge con variables históricas registró RMSE de 502.11 y MAE de 325.98, frente a RMSE de 595.02 y MAE de 400.19 de la persistencia del último valor semanal observado. En h=4, el promedio móvil de cuatro semanas fue la alternativa con menor RMSE descriptivo (652.52) y MAE de 427.63. Las métricas no se combinan entre horizontes.</w:t>
+      </w:r>
+    </w:p>
+    <w:p>
+      <w:pPr/>
+      <w:r>
+        <w:t>Para la planeación de cuatro semanas, el pipeline suma las estimaciones directas h=1, h=2, h=3 y h=4. Esta salida se conserva como consolidado presupuestal histórico y no equivale a un modelo mensual independiente. La comparación incluye 21 configuraciones en 16 orígenes comunes, con 336 registros consolidados.</w:t>
+      </w:r>
     </w:p>
     <w:p>
       <w:pPr>
@@ -39327,7 +39245,7 @@
         <w:spacing w:after="120"/>
       </w:pPr>
       <w:r>
-        <w:t>Las arquitecturas RNN y LSTM no superaron a los modelos ganadores. El mejor RMSE recurrente fue 163.777 para importe de ventas, 0.545 para registros de ventas, 239.714 para importe de compras y 2.748 para registros de compras. El resultado respalda el uso de modelos más parsimoniosos ante el tamaño muestral disponible y la demanda intermitente.</w:t>
+        <w:t>Las arquitecturas RNN y LSTM no se utilizaron como evidencia principal en la evaluación semanal. Con 135 semanas observadas, se priorizaron modelos estadísticos y de aprendizaje automático parsimoniosos; las redes recurrentes se reservan como comparación secundaria para una futura ampliación de la cobertura.</w:t>
       </w:r>
     </w:p>
     <w:p>
@@ -39349,12 +39267,9 @@
         <w:spacing w:after="120"/>
       </w:pPr>
       <w:r>
-        <w:t xml:space="preserve">La hipótesis H1 estableció una reducción mínima de 20 % en el RMSE del importe diario de compras frente a la línea base. El umbral se alcanzó en importe y registros de compras mediante Random Forest. En consecuencia, H1 se respaldó para el presupuesto de </w:t>
-      </w:r>
-      <w:r>
-        <w:lastRenderedPageBreak/>
-        <w:t>abastecimiento. Los resultados de ventas se reportan como análisis complementario y muestran que ARIMA fue más competitivo en ese dominio.</w:t>
-      </w:r>
+        <w:t>H1 se contrastó principalmente en h=1 contra la línea base de último valor semanal observado. Aunque Ridge histórico mostró el menor RMSE descriptivo en h=1 (502.11 frente a 595.02 de la referencia), ninguna configuración presentó una diferencia significativa después de la prueba Diebold-Mariano unilateral con ajuste Holm. En h=4 tampoco se obtuvieron contrastes significativos. En consecuencia, H1 no queda respaldada con la evidencia disponible; el resultado debe comunicarse como comparación descriptiva y no como demostración de superioridad.</w:t>
+      </w:r>
+      <w:r/>
     </w:p>
     <w:p>
       <w:pPr>
@@ -39375,98 +39290,38 @@
         <w:spacing w:after="120"/>
       </w:pPr>
       <w:r>
-        <w:t xml:space="preserve">El tablero integró los modelos ganadores, métricas globales, desempeño por ventana, cobertura y contraste de hipótesis. Los filtros permiten seleccionar objetivo y representación; las salvaguardas advierten cuando la cobertura está desactualizada o la mejora no alcanza el umbral. La interfaz funciona como capa de comunicación analítica y mantiene la decisión final bajo responsabilidad del usuario. Las métricas y el criterio comparativo se formalizan en las ecuaciones </w:t>
-      </w:r>
-      <w:r>
-        <w:fldChar w:fldCharType="begin"/>
-      </w:r>
-      <w:r>
-        <w:instrText xml:space="preserve"> REF xref_ecuacion_11 \h </w:instrText>
-      </w:r>
-      <w:r>
-        <w:fldChar w:fldCharType="separate"/>
-      </w:r>
-      <w:r>
-        <w:t>(11)</w:t>
-      </w:r>
-      <w:r>
-        <w:fldChar w:fldCharType="end"/>
-      </w:r>
-      <w:r>
-        <w:t xml:space="preserve">, </w:t>
-      </w:r>
-      <w:r>
-        <w:fldChar w:fldCharType="begin"/>
-      </w:r>
-      <w:r>
-        <w:instrText xml:space="preserve"> REF xref_ecuacion_12 \h </w:instrText>
-      </w:r>
-      <w:r>
-        <w:fldChar w:fldCharType="separate"/>
-      </w:r>
-      <w:r>
-        <w:t>(12)</w:t>
-      </w:r>
-      <w:r>
-        <w:fldChar w:fldCharType="end"/>
-      </w:r>
-      <w:r>
-        <w:t xml:space="preserve">, </w:t>
-      </w:r>
-      <w:r>
-        <w:fldChar w:fldCharType="begin"/>
-      </w:r>
-      <w:r>
-        <w:instrText xml:space="preserve"> REF xref_ecuacion_13 \h </w:instrText>
-      </w:r>
-      <w:r>
-        <w:fldChar w:fldCharType="separate"/>
-      </w:r>
-      <w:r>
-        <w:t>(13)</w:t>
-      </w:r>
-      <w:r>
-        <w:fldChar w:fldCharType="end"/>
-      </w:r>
-      <w:r>
-        <w:t xml:space="preserve">, </w:t>
-      </w:r>
-      <w:r>
-        <w:fldChar w:fldCharType="begin"/>
-      </w:r>
-      <w:r>
-        <w:instrText xml:space="preserve"> REF xref_ecuacion_14 \h </w:instrText>
-      </w:r>
-      <w:r>
-        <w:fldChar w:fldCharType="separate"/>
-      </w:r>
-      <w:r>
-        <w:t>(14)</w:t>
-      </w:r>
-      <w:r>
-        <w:fldChar w:fldCharType="end"/>
-      </w:r>
-      <w:r>
-        <w:t xml:space="preserve"> y </w:t>
-      </w:r>
-      <w:r>
-        <w:fldChar w:fldCharType="begin"/>
-      </w:r>
-      <w:r>
-        <w:instrText xml:space="preserve"> REF xref_ecuacion_15 \h </w:instrText>
-      </w:r>
-      <w:r>
-        <w:fldChar w:fldCharType="separate"/>
-      </w:r>
-      <w:r>
-        <w:t>(15)</w:t>
-      </w:r>
-      <w:r>
-        <w:fldChar w:fldCharType="end"/>
-      </w:r>
-      <w:r>
-        <w:t>.</w:t>
-      </w:r>
+        <w:t>El DSS integra métricas y predicciones de validación por horizonte, el consolidado de cuatro semanas, los contrastes H1 y H2 y el registro de variables exógenas. Las salvaguardas comunican cobertura, disponibilidad ex ante y el carácter histórico de los resultados. La interfaz debe mantener la decisión final bajo responsabilidad de la persona usuaria.</w:t>
+      </w:r>
+      <w:r/>
+      <w:r/>
+      <w:r/>
+      <w:r/>
+      <w:r/>
+      <w:r/>
+      <w:r/>
+      <w:r/>
+      <w:r/>
+      <w:r/>
+      <w:r/>
+      <w:r/>
+      <w:r/>
+      <w:r/>
+      <w:r/>
+      <w:r/>
+      <w:r/>
+      <w:r/>
+      <w:r/>
+      <w:r/>
+      <w:r/>
+      <w:r/>
+      <w:r/>
+      <w:r/>
+      <w:r/>
+      <w:r/>
+      <w:r/>
+      <w:r/>
+      <w:r/>
+      <w:r/>
     </w:p>
     <w:tbl>
       <w:tblPr>
@@ -39913,26 +39768,14 @@
         <w:spacing w:after="120"/>
       </w:pPr>
       <w:r>
-        <w:t xml:space="preserve">ARIMA fue la familia ganadora para ambos objetivos de ventas, mientras que Random Forest sobre el dataset reducido obtuvo el mejor desempeño en compras. Los resultados se resumen en la Tabla </w:t>
-      </w:r>
-      <w:r>
-        <w:fldChar w:fldCharType="begin"/>
-      </w:r>
-      <w:r>
-        <w:instrText xml:space="preserve"> REF xref_tabla_11 \h </w:instrText>
-      </w:r>
-      <w:r>
-        <w:fldChar w:fldCharType="separate"/>
-      </w:r>
-      <w:r>
-        <w:t>11</w:t>
-      </w:r>
-      <w:r>
-        <w:fldChar w:fldCharType="end"/>
-      </w:r>
-      <w:r>
-        <w:t>; la MAPE se reporta únicamente como referencia debido a la elevada frecuencia de valores cero.</w:t>
-      </w:r>
+        <w:t>Los resultados se reportan exclusivamente para el importe semanal de compras. En h=1, Ridge histórico obtuvo el menor RMSE descriptivo; en h=4, el promedio móvil de cuatro semanas obtuvo el menor RMSE descriptivo. La MAPE se mantiene como indicador secundario debido a la presencia de semanas con importe cero.</w:t>
+      </w:r>
+      <w:r/>
+      <w:r/>
+      <w:r/>
+      <w:r/>
+      <w:r/>
+      <w:r/>
     </w:p>
     <w:p>
       <w:pPr>
@@ -40429,7 +40272,7 @@
         <w:spacing w:after="120"/>
       </w:pPr>
       <w:r>
-        <w:t>La superioridad de ARIMA en ventas indica que la dinámica agregada se explica mejor mediante dependencia temporal y diferenciación que mediante una estructura de alta complejidad. En compras, Random Forest capturó relaciones no lineales entre rezagos, ventanas y composición categórica, con mejoras superiores al umbral de la hipótesis.</w:t>
+        <w:t>Los hallazgos no respaldan una superioridad general de un modelo complejo. En h=1, Ridge histórico mostró el menor RMSE descriptivo; en h=4, una referencia empírica simple resultó competitiva. Esta diferencia entre horizontes refuerza la necesidad de informar métricas separadas y de no trasladar conclusiones de un horizonte a otro.</w:t>
       </w:r>
     </w:p>
     <w:p>
@@ -40437,7 +40280,7 @@
         <w:spacing w:after="120"/>
       </w:pPr>
       <w:r>
-        <w:t>El resultado de RNN y LSTM muestra que una arquitectura más compleja no implica automáticamente una mejor predicción. Con 1,584 observaciones, alta dimensionalidad y numerosos días con valor cero, el incremento de parámetros eleva el riesgo de varianza y limita la generalización.</w:t>
+        <w:t>La evaluación refuerza que una arquitectura más compleja no implica mayor precisión. La muestra semanal limitada, la intermitencia y la heterogeneidad de las compras justifican mantener alternativas parsimoniosas y referencias empíricas como controles permanentes.</w:t>
       </w:r>
     </w:p>
     <w:p>
@@ -40459,7 +40302,7 @@
         <w:spacing w:after="120"/>
       </w:pPr>
       <w:r>
-        <w:t>La proporción de días con valor cero fue aproximadamente 75.9 % en ventas y 82.0 % en compras. Esta condición vuelve inestable la MAPE y explica sus valores elevados; por ello, las conclusiones se fundamentaron principalmente en RMSE y MAE. WAPE se incorporó como métrica complementaria propuesta para futuras corridas, sin atribuirle resultados que no fueron persistidos por el pipeline.</w:t>
+        <w:t>La serie semanal conserva episodios con importe cero y picos de compra, por lo que MAPE puede ser inestable o no estar definido en algunas semanas. Las conclusiones se sustentan principalmente en RMSE, MAE y métricas escaladas; MAPE se presenta sólo como diagnóstico condicionado a valores observados distintos de cero.</w:t>
       </w:r>
     </w:p>
     <w:p>
@@ -40481,7 +40324,7 @@
         <w:spacing w:after="120"/>
       </w:pPr>
       <w:r>
-        <w:t>La evidencia permite priorizar el uso predictivo en compras, donde la mejora fue material y consistente con la necesidad de anticipar el presupuesto de abastecimiento. No es posible inferir reducción efectiva de faltantes o sobreabastecimiento, porque no se cuenta con inventarios, recetas, mermas ni tiempos de entrega. Para ventas, el DSS debe emplearse como referencia de tendencia y alerta, acompañado del juicio del responsable del negocio, ya que ARIMA fue más competitivo que los modelos de aprendizaje automático.</w:t>
+        <w:t>La evidencia permite utilizar los pronósticos como apoyo exploratorio para revisar el presupuesto de compras, pero no para automatizar decisiones. La ausencia de significancia tras Holm implica que la referencia de último valor semanal debe seguir acompañando cualquier recomendación. Tampoco es posible inferir reducciones efectivas de faltantes, sobreabastecimiento o merma sin datos de inventario, recetas y tiempos de entrega.</w:t>
       </w:r>
     </w:p>
     <w:p>
@@ -40504,7 +40347,7 @@
         <w:spacing w:after="120"/>
       </w:pPr>
       <w:r>
-        <w:t>La validez interna se fortaleció mediante separación temporal, desplazamiento de características y comparación sobre ventanas equivalentes. La validez externa es limitada porque se estudió una sola microempresa. Además, la menor cobertura de compras, la concentración de ceros y la ausencia de inventarios, mermas, tiempos de entrega y costos de faltante restringen la simulación prescriptiva.</w:t>
+        <w:t>La validez interna se fortaleció mediante orden temporal, ventana fija, exclusión de cobertura ausente, bloqueo de datos sintéticos y control explícito de disponibilidad de exógenas. La validez externa permanece limitada por tratarse de una sola microempresa, 135 semanas observadas y 16 orígenes finales. Estos límites explican la interpretación conservadora de los contrastes de hipótesis.</w:t>
       </w:r>
     </w:p>
     <w:p>
@@ -40528,7 +40371,7 @@
         <w:spacing w:after="120"/>
       </w:pPr>
       <w:r>
-        <w:t>Se construyó una solución analítica reproducible que integra datos transaccionales y exógenos, transforma las series mediante ingeniería de características, compara modelos con validación temporal y comunica los resultados en un DSS. El proceso convirtió registros dispersos en evidencia verificable para anticipar el presupuesto de abastecimiento.</w:t>
+        <w:t>Se construyó una solución semanal reproducible que integra registros de compras, características históricas y variables exógenas registradas. El proceso compara modelos mediante rolling-window, separa h=1 y h=4, genera un consolidado de cuatro semanas y comunica los resultados en un DSS auditable.</w:t>
       </w:r>
     </w:p>
     <w:p>
@@ -40536,7 +40379,7 @@
         <w:spacing w:after="120"/>
       </w:pPr>
       <w:r>
-        <w:t>La hipótesis se respaldó para el presupuesto de abastecimiento. Random Forest redujo el RMSE de compras en 28.3 % para importes y 22.8 % para registros frente a la línea base. ARIMA fue más competitivo para ventas; por ello, la evidencia no respalda una superioridad general de los modelos de aprendizaje automático para todos los objetivos, sino su utilidad específica para anticipar compras.</w:t>
+        <w:t>La evidencia no respalda H1 bajo el criterio inferencial predefinido: aunque Ridge histórico redujo descriptivamente el RMSE en h=1, ninguna configuración superó el contraste Diebold-Mariano con ajuste Holm. En h=4, una línea base de promedio móvil fue la alternativa con menor RMSE descriptivo. Por ello, no se afirma superioridad general de los modelos estadísticos o de aprendizaje automático frente a la referencia primaria.</w:t>
       </w:r>
     </w:p>
     <w:p>
@@ -40544,7 +40387,7 @@
         <w:spacing w:after="120"/>
       </w:pPr>
       <w:r>
-        <w:t>El estudio también demuestra que, en un contexto de Small Data y demanda intermitente, la parsimonia, la calidad de las variables y la validación temporal pueden ser más relevantes que la complejidad algorítmica.</w:t>
+        <w:t>El estudio muestra que, en un contexto de Small Data e intermitencia, la parsimonia, la calidad de las variables, la disponibilidad ex ante y la validación temporal son más relevantes que la complejidad algorítmica. La ausencia de respaldo de H1 también constituye conocimiento útil: impide recomendar un modelo como superior sin evidencia suficiente.</w:t>
       </w:r>
     </w:p>
     <w:p>
@@ -40566,7 +40409,7 @@
         <w:spacing w:after="120"/>
       </w:pPr>
       <w:r>
-        <w:t>Se recomienda actualizar mensualmente las fuentes, vigilar la cobertura de compras, conservar la línea base como referencia permanente y reentrenar cuando el RMSE por ventana muestre deterioro sostenido. El pronóstico debe utilizarse para reservar y revisar el presupuesto de abastecimiento; las decisiones de compra deben incorporar revisión humana y límites financieros.</w:t>
+        <w:t>Se recomienda actualizar semanalmente los registros de compras y ejecutar nuevamente el pipeline antes de usar pronósticos operativos. Debe conservarse la línea base de último valor como referencia, revisar por separado h=1 y h=4 y comunicar el consolidado sólo como suma de cuatro pronósticos semanales. Las decisiones deben incluir revisión humana y límites financieros.</w:t>
       </w:r>
     </w:p>
     <w:p>
@@ -40588,7 +40431,7 @@
         <w:spacing w:after="120"/>
       </w:pPr>
       <w:r>
-        <w:t>Como trabajo futuro, conviene registrar inventario inicial y final, recetas, merma, costo de faltante, tiempo de entrega y promociones; homologar las unidades de medida por insumo; evaluar modelos específicos para demanda intermitente; y efectuar una validación prospectiva antes de automatizar recomendaciones de compra por volumen.</w:t>
+        <w:t>Como trabajo futuro, conviene ampliar la cobertura observada de compras, registrar inventario inicial y final, recetas, merma, costo de faltante y tiempos de entrega; además, realizar validación prospectiva y analizar si los resultados se sostienen con más orígenes de prueba. También puede evaluarse un modelo mensual independiente únicamente cuando exista una serie mensual suficiente y una necesidad de decisión claramente diferenciada.</w:t>
       </w:r>
     </w:p>
     <w:p>

</xml_diff>